<commit_message>
Day 9: deepen Materi to the plan's Wissen (rule 2.17) with real findings
All 12 Wissen bullets are now full: the definition and the review of 24 studies, self-determination
theory, the meta-analysis of 128 experiments, the overjustification study, the BE FIT trial with its
decay after the game, dark patterns and DSA Article 25. Day 9 added to verify:depth; Word
documents of Day 9 rebuilt.

Co-Authored-By: Claude Sonnet 5.5 <noreply@anthropic.com>
</commit_message>
<xml_diff>
--- a/docx/Day9-Materi-AION-UX-Developer-Gamification-strategies-and-storytelling-with-gamification.docx
+++ b/docx/Day9-Materi-AION-UX-Developer-Gamification-strategies-and-storytelling-with-gamification.docx
@@ -2791,6 +2791,266 @@
         <w:spacing w:before="0" w:after="80"/>
       </w:pPr>
     </w:p>
+    <w:p>
+      <w:pPr>
+        <w:spacing w:before="0" w:after="100"/>
+      </w:pPr>
+      <w:r>
+        <w:rPr>
+          <w:b/>
+        </w:rPr>
+        <w:t>Gamification, playful design and a game: definitions and evidence</w:t>
+      </w:r>
+    </w:p>
+    <w:tbl>
+      <w:tblPr>
+        <w:tblW w:w="9638" w:type="dxa"/>
+        <w:tblBorders>
+          <w:top w:val="single" w:sz="4" w:space="0" w:color="D5DEE9"/>
+          <w:left w:val="single" w:sz="4" w:space="0" w:color="D5DEE9"/>
+          <w:bottom w:val="single" w:sz="4" w:space="0" w:color="D5DEE9"/>
+          <w:right w:val="single" w:sz="4" w:space="0" w:color="D5DEE9"/>
+          <w:insideH w:val="single" w:sz="4" w:space="0" w:color="D5DEE9"/>
+          <w:insideV w:val="single" w:sz="4" w:space="0" w:color="D5DEE9"/>
+        </w:tblBorders>
+        <w:tblLayout w:type="fixed"/>
+        <w:tblCellMar>
+          <w:top w:w="60" w:type="dxa"/>
+          <w:left w:w="100" w:type="dxa"/>
+          <w:bottom w:w="60" w:type="dxa"/>
+          <w:right w:w="100" w:type="dxa"/>
+        </w:tblCellMar>
+      </w:tblPr>
+      <w:tblGrid>
+        <w:gridCol w:w="1957"/>
+        <w:gridCol w:w="4706"/>
+        <w:gridCol w:w="2975"/>
+      </w:tblGrid>
+      <w:tr>
+        <w:trPr>
+          <w:cantSplit/>
+          <w:tblHeader/>
+        </w:trPr>
+        <w:tc>
+          <w:tcPr>
+            <w:tcW w:type="dxa" w:w="1957"/>
+            <w:shd w:val="clear" w:color="auto" w:fill="E6ECF4"/>
+          </w:tcPr>
+          <w:p>
+            <w:pPr>
+              <w:spacing w:before="0" w:after="0"/>
+            </w:pPr>
+            <w:r>
+              <w:rPr>
+                <w:b/>
+                <w:sz w:val="20"/>
+              </w:rPr>
+              <w:t>Source</w:t>
+            </w:r>
+          </w:p>
+        </w:tc>
+        <w:tc>
+          <w:tcPr>
+            <w:tcW w:type="dxa" w:w="4706"/>
+            <w:shd w:val="clear" w:color="auto" w:fill="E6ECF4"/>
+          </w:tcPr>
+          <w:p>
+            <w:pPr>
+              <w:spacing w:before="0" w:after="0"/>
+            </w:pPr>
+            <w:r>
+              <w:rPr>
+                <w:b/>
+                <w:sz w:val="20"/>
+              </w:rPr>
+              <w:t>Real finding</w:t>
+            </w:r>
+          </w:p>
+        </w:tc>
+        <w:tc>
+          <w:tcPr>
+            <w:tcW w:type="dxa" w:w="2975"/>
+            <w:shd w:val="clear" w:color="auto" w:fill="E6ECF4"/>
+          </w:tcPr>
+          <w:p>
+            <w:pPr>
+              <w:spacing w:before="0" w:after="0"/>
+            </w:pPr>
+            <w:r>
+              <w:rPr>
+                <w:b/>
+                <w:sz w:val="20"/>
+              </w:rPr>
+              <w:t>What it means for a screen</w:t>
+            </w:r>
+          </w:p>
+        </w:tc>
+      </w:tr>
+      <w:tr>
+        <w:trPr>
+          <w:cantSplit/>
+        </w:trPr>
+        <w:tc>
+          <w:tcPr>
+            <w:tcW w:type="dxa" w:w="1957"/>
+          </w:tcPr>
+          <w:p>
+            <w:pPr>
+              <w:spacing w:before="0" w:after="0"/>
+            </w:pPr>
+            <w:r>
+              <w:rPr>
+                <w:sz w:val="20"/>
+              </w:rPr>
+              <w:t>The definition</w:t>
+            </w:r>
+          </w:p>
+        </w:tc>
+        <w:tc>
+          <w:tcPr>
+            <w:tcW w:type="dxa" w:w="4706"/>
+          </w:tcPr>
+          <w:p>
+            <w:pPr>
+              <w:spacing w:before="0" w:after="0"/>
+            </w:pPr>
+            <w:r>
+              <w:rPr>
+                <w:sz w:val="20"/>
+              </w:rPr>
+              <w:t>Gamification is the use of game design elements in non-game contexts (Deterding et al. 2011).</w:t>
+            </w:r>
+          </w:p>
+        </w:tc>
+        <w:tc>
+          <w:tcPr>
+            <w:tcW w:type="dxa" w:w="2975"/>
+          </w:tcPr>
+          <w:p>
+            <w:pPr>
+              <w:spacing w:before="0" w:after="0"/>
+            </w:pPr>
+            <w:r>
+              <w:rPr>
+                <w:sz w:val="20"/>
+              </w:rPr>
+              <w:t>Ask which element you borrow (a goal, a position, feedback) and for what real task.</w:t>
+            </w:r>
+          </w:p>
+        </w:tc>
+      </w:tr>
+      <w:tr>
+        <w:trPr>
+          <w:cantSplit/>
+        </w:trPr>
+        <w:tc>
+          <w:tcPr>
+            <w:tcW w:type="dxa" w:w="1957"/>
+          </w:tcPr>
+          <w:p>
+            <w:pPr>
+              <w:spacing w:before="0" w:after="0"/>
+            </w:pPr>
+            <w:r>
+              <w:rPr>
+                <w:sz w:val="20"/>
+              </w:rPr>
+              <w:t>Does it work?</w:t>
+            </w:r>
+          </w:p>
+        </w:tc>
+        <w:tc>
+          <w:tcPr>
+            <w:tcW w:type="dxa" w:w="4706"/>
+          </w:tcPr>
+          <w:p>
+            <w:pPr>
+              <w:spacing w:before="0" w:after="0"/>
+            </w:pPr>
+            <w:r>
+              <w:rPr>
+                <w:sz w:val="20"/>
+              </w:rPr>
+              <w:t>A review of 24 empirical studies found mostly positive effects, but the effects depended greatly on the context and on the users (Hamari et al. 2014).</w:t>
+            </w:r>
+          </w:p>
+        </w:tc>
+        <w:tc>
+          <w:tcPr>
+            <w:tcW w:type="dxa" w:w="2975"/>
+          </w:tcPr>
+          <w:p>
+            <w:pPr>
+              <w:spacing w:before="0" w:after="0"/>
+            </w:pPr>
+            <w:r>
+              <w:rPr>
+                <w:sz w:val="20"/>
+              </w:rPr>
+              <w:t>Do not assume an effect: name the context and the group, and measure.</w:t>
+            </w:r>
+          </w:p>
+        </w:tc>
+      </w:tr>
+      <w:tr>
+        <w:trPr>
+          <w:cantSplit/>
+        </w:trPr>
+        <w:tc>
+          <w:tcPr>
+            <w:tcW w:type="dxa" w:w="1957"/>
+          </w:tcPr>
+          <w:p>
+            <w:pPr>
+              <w:spacing w:before="0" w:after="0"/>
+            </w:pPr>
+            <w:r>
+              <w:rPr>
+                <w:sz w:val="20"/>
+              </w:rPr>
+              <w:t>Meaningful gamification</w:t>
+            </w:r>
+          </w:p>
+        </w:tc>
+        <w:tc>
+          <w:tcPr>
+            <w:tcW w:type="dxa" w:w="4706"/>
+          </w:tcPr>
+          <w:p>
+            <w:pPr>
+              <w:spacing w:before="0" w:after="0"/>
+            </w:pPr>
+            <w:r>
+              <w:rPr>
+                <w:sz w:val="20"/>
+              </w:rPr>
+              <w:t>Nicholson argues that gamification should be built around what is meaningful for the user, not around rewards alone (Nicholson 2015).</w:t>
+            </w:r>
+          </w:p>
+        </w:tc>
+        <w:tc>
+          <w:tcPr>
+            <w:tcW w:type="dxa" w:w="2975"/>
+          </w:tcPr>
+          <w:p>
+            <w:pPr>
+              <w:spacing w:before="0" w:after="0"/>
+            </w:pPr>
+            <w:r>
+              <w:rPr>
+                <w:sz w:val="20"/>
+              </w:rPr>
+              <w:t>Start from the user's own goal, then choose the mechanic.</w:t>
+            </w:r>
+          </w:p>
+        </w:tc>
+      </w:tr>
+    </w:tbl>
+    <w:p>
+      <w:pPr>
+        <w:spacing w:before="0" w:after="80"/>
+      </w:pPr>
+    </w:p>
     <w:tbl>
       <w:tblPr>
         <w:tblW w:w="9598" w:type="dxa"/>
@@ -2840,7 +3100,7 @@
             </w:pPr>
             <w:r>
               <w:rPr/>
-              <w:t>Brightwater Savings, Vera, Kaspar, Rhea and Dominik are made up for this example. Gamification as game design elements in non-game contexts, apart from playful design and full games, follows Deterding et al. (2011); its context-dependent effects follow Hamari et al. (2014).</w:t>
+              <w:t>Brightwater Savings, Vera, Kaspar, Rhea and Dominik are made up for this example. Gamification as game design elements in non-game contexts, apart from playful design and full games, follows Deterding et al. (2011); its context-dependent effects follow Hamari et al. (2014). The findings in the table of real evidence are real research results, rules and cases; the sources are listed below.</w:t>
             </w:r>
           </w:p>
         </w:tc>
@@ -3743,6 +4003,319 @@
         <w:spacing w:before="0" w:after="80"/>
       </w:pPr>
     </w:p>
+    <w:p>
+      <w:pPr>
+        <w:spacing w:before="0" w:after="100"/>
+      </w:pPr>
+      <w:r>
+        <w:rPr>
+          <w:b/>
+        </w:rPr>
+        <w:t>Why people react to progress, feedback and recognition: sources</w:t>
+      </w:r>
+    </w:p>
+    <w:tbl>
+      <w:tblPr>
+        <w:tblW w:w="9638" w:type="dxa"/>
+        <w:tblBorders>
+          <w:top w:val="single" w:sz="4" w:space="0" w:color="D5DEE9"/>
+          <w:left w:val="single" w:sz="4" w:space="0" w:color="D5DEE9"/>
+          <w:bottom w:val="single" w:sz="4" w:space="0" w:color="D5DEE9"/>
+          <w:right w:val="single" w:sz="4" w:space="0" w:color="D5DEE9"/>
+          <w:insideH w:val="single" w:sz="4" w:space="0" w:color="D5DEE9"/>
+          <w:insideV w:val="single" w:sz="4" w:space="0" w:color="D5DEE9"/>
+        </w:tblBorders>
+        <w:tblLayout w:type="fixed"/>
+        <w:tblCellMar>
+          <w:top w:w="60" w:type="dxa"/>
+          <w:left w:w="100" w:type="dxa"/>
+          <w:bottom w:w="60" w:type="dxa"/>
+          <w:right w:w="100" w:type="dxa"/>
+        </w:tblCellMar>
+      </w:tblPr>
+      <w:tblGrid>
+        <w:gridCol w:w="2048"/>
+        <w:gridCol w:w="4608"/>
+        <w:gridCol w:w="2982"/>
+      </w:tblGrid>
+      <w:tr>
+        <w:trPr>
+          <w:cantSplit/>
+          <w:tblHeader/>
+        </w:trPr>
+        <w:tc>
+          <w:tcPr>
+            <w:tcW w:type="dxa" w:w="2048"/>
+            <w:shd w:val="clear" w:color="auto" w:fill="E6ECF4"/>
+          </w:tcPr>
+          <w:p>
+            <w:pPr>
+              <w:spacing w:before="0" w:after="0"/>
+            </w:pPr>
+            <w:r>
+              <w:rPr>
+                <w:b/>
+                <w:sz w:val="20"/>
+              </w:rPr>
+              <w:t>Lever</w:t>
+            </w:r>
+          </w:p>
+        </w:tc>
+        <w:tc>
+          <w:tcPr>
+            <w:tcW w:type="dxa" w:w="4608"/>
+            <w:shd w:val="clear" w:color="auto" w:fill="E6ECF4"/>
+          </w:tcPr>
+          <w:p>
+            <w:pPr>
+              <w:spacing w:before="0" w:after="0"/>
+            </w:pPr>
+            <w:r>
+              <w:rPr>
+                <w:b/>
+                <w:sz w:val="20"/>
+              </w:rPr>
+              <w:t>Real finding</w:t>
+            </w:r>
+          </w:p>
+        </w:tc>
+        <w:tc>
+          <w:tcPr>
+            <w:tcW w:type="dxa" w:w="2982"/>
+            <w:shd w:val="clear" w:color="auto" w:fill="E6ECF4"/>
+          </w:tcPr>
+          <w:p>
+            <w:pPr>
+              <w:spacing w:before="0" w:after="0"/>
+            </w:pPr>
+            <w:r>
+              <w:rPr>
+                <w:b/>
+                <w:sz w:val="20"/>
+              </w:rPr>
+              <w:t>What it means for a mechanic</w:t>
+            </w:r>
+          </w:p>
+        </w:tc>
+      </w:tr>
+      <w:tr>
+        <w:trPr>
+          <w:cantSplit/>
+        </w:trPr>
+        <w:tc>
+          <w:tcPr>
+            <w:tcW w:type="dxa" w:w="2048"/>
+          </w:tcPr>
+          <w:p>
+            <w:pPr>
+              <w:spacing w:before="0" w:after="0"/>
+            </w:pPr>
+            <w:r>
+              <w:rPr>
+                <w:sz w:val="20"/>
+              </w:rPr>
+              <w:t>Autonomy, competence, relatedness</w:t>
+            </w:r>
+          </w:p>
+        </w:tc>
+        <w:tc>
+          <w:tcPr>
+            <w:tcW w:type="dxa" w:w="4608"/>
+          </w:tcPr>
+          <w:p>
+            <w:pPr>
+              <w:spacing w:before="0" w:after="0"/>
+            </w:pPr>
+            <w:r>
+              <w:rPr>
+                <w:sz w:val="20"/>
+              </w:rPr>
+              <w:t>Self-determination theory names three basic needs whose satisfaction supports lasting motivation (Ryan and Deci 2000).</w:t>
+            </w:r>
+          </w:p>
+        </w:tc>
+        <w:tc>
+          <w:tcPr>
+            <w:tcW w:type="dxa" w:w="2982"/>
+          </w:tcPr>
+          <w:p>
+            <w:pPr>
+              <w:spacing w:before="0" w:after="0"/>
+            </w:pPr>
+            <w:r>
+              <w:rPr>
+                <w:sz w:val="20"/>
+              </w:rPr>
+              <w:t>Check each mechanic against the three needs: does it give choice, a sense of skill and a link to others?</w:t>
+            </w:r>
+          </w:p>
+        </w:tc>
+      </w:tr>
+      <w:tr>
+        <w:trPr>
+          <w:cantSplit/>
+        </w:trPr>
+        <w:tc>
+          <w:tcPr>
+            <w:tcW w:type="dxa" w:w="2048"/>
+          </w:tcPr>
+          <w:p>
+            <w:pPr>
+              <w:spacing w:before="0" w:after="0"/>
+            </w:pPr>
+            <w:r>
+              <w:rPr>
+                <w:sz w:val="20"/>
+              </w:rPr>
+              <w:t>Self-efficacy</w:t>
+            </w:r>
+          </w:p>
+        </w:tc>
+        <w:tc>
+          <w:tcPr>
+            <w:tcW w:type="dxa" w:w="4608"/>
+          </w:tcPr>
+          <w:p>
+            <w:pPr>
+              <w:spacing w:before="0" w:after="0"/>
+            </w:pPr>
+            <w:r>
+              <w:rPr>
+                <w:sz w:val="20"/>
+              </w:rPr>
+              <w:t>Bandura described the belief that one can do something as a main source of effort and persistence (Bandura 1977).</w:t>
+            </w:r>
+          </w:p>
+        </w:tc>
+        <w:tc>
+          <w:tcPr>
+            <w:tcW w:type="dxa" w:w="2982"/>
+          </w:tcPr>
+          <w:p>
+            <w:pPr>
+              <w:spacing w:before="0" w:after="0"/>
+            </w:pPr>
+            <w:r>
+              <w:rPr>
+                <w:sz w:val="20"/>
+              </w:rPr>
+              <w:t>Show what the person can do now that they could not before.</w:t>
+            </w:r>
+          </w:p>
+        </w:tc>
+      </w:tr>
+      <w:tr>
+        <w:trPr>
+          <w:cantSplit/>
+        </w:trPr>
+        <w:tc>
+          <w:tcPr>
+            <w:tcW w:type="dxa" w:w="2048"/>
+          </w:tcPr>
+          <w:p>
+            <w:pPr>
+              <w:spacing w:before="0" w:after="0"/>
+            </w:pPr>
+            <w:r>
+              <w:rPr>
+                <w:sz w:val="20"/>
+              </w:rPr>
+              <w:t>Social comparison</w:t>
+            </w:r>
+          </w:p>
+        </w:tc>
+        <w:tc>
+          <w:tcPr>
+            <w:tcW w:type="dxa" w:w="4608"/>
+          </w:tcPr>
+          <w:p>
+            <w:pPr>
+              <w:spacing w:before="0" w:after="0"/>
+            </w:pPr>
+            <w:r>
+              <w:rPr>
+                <w:sz w:val="20"/>
+              </w:rPr>
+              <w:t>People judge their own ability by comparing themselves with others (Festinger 1954).</w:t>
+            </w:r>
+          </w:p>
+        </w:tc>
+        <w:tc>
+          <w:tcPr>
+            <w:tcW w:type="dxa" w:w="2982"/>
+          </w:tcPr>
+          <w:p>
+            <w:pPr>
+              <w:spacing w:before="0" w:after="0"/>
+            </w:pPr>
+            <w:r>
+              <w:rPr>
+                <w:sz w:val="20"/>
+              </w:rPr>
+              <w:t>Rankings motivate those near the top and can discourage those at the bottom.</w:t>
+            </w:r>
+          </w:p>
+        </w:tc>
+      </w:tr>
+      <w:tr>
+        <w:trPr>
+          <w:cantSplit/>
+        </w:trPr>
+        <w:tc>
+          <w:tcPr>
+            <w:tcW w:type="dxa" w:w="2048"/>
+          </w:tcPr>
+          <w:p>
+            <w:pPr>
+              <w:spacing w:before="0" w:after="0"/>
+            </w:pPr>
+            <w:r>
+              <w:rPr>
+                <w:sz w:val="20"/>
+              </w:rPr>
+              <w:t>Progress</w:t>
+            </w:r>
+          </w:p>
+        </w:tc>
+        <w:tc>
+          <w:tcPr>
+            <w:tcW w:type="dxa" w:w="4608"/>
+          </w:tcPr>
+          <w:p>
+            <w:pPr>
+              <w:spacing w:before="0" w:after="0"/>
+            </w:pPr>
+            <w:r>
+              <w:rPr>
+                <w:sz w:val="20"/>
+              </w:rPr>
+              <w:t>Customers in a real reward programme bought more often the closer they were to the reward (Kivetz et al. 2006).</w:t>
+            </w:r>
+          </w:p>
+        </w:tc>
+        <w:tc>
+          <w:tcPr>
+            <w:tcW w:type="dxa" w:w="2982"/>
+          </w:tcPr>
+          <w:p>
+            <w:pPr>
+              <w:spacing w:before="0" w:after="0"/>
+            </w:pPr>
+            <w:r>
+              <w:rPr>
+                <w:sz w:val="20"/>
+              </w:rPr>
+              <w:t>Show the distance to a goal that is the person's own.</w:t>
+            </w:r>
+          </w:p>
+        </w:tc>
+      </w:tr>
+    </w:tbl>
+    <w:p>
+      <w:pPr>
+        <w:spacing w:before="0" w:after="80"/>
+      </w:pPr>
+    </w:p>
     <w:tbl>
       <w:tblPr>
         <w:tblW w:w="9598" w:type="dxa"/>
@@ -3792,7 +4365,7 @@
             </w:pPr>
             <w:r>
               <w:rPr/>
-              <w:t>Brightwater Savings, Vera, Kaspar, Rhea and Dominik are made up for this example. Competence, autonomy and relatedness as needs behind lasting motivation follow Ryan and Deci (2000); self-efficacy follows Bandura (1977); social comparison follows Festinger (1954).</w:t>
+              <w:t>Brightwater Savings, Vera, Kaspar, Rhea and Dominik are made up for this example. Competence, autonomy and relatedness as needs behind lasting motivation follow Ryan and Deci (2000); self-efficacy follows Bandura (1977); social comparison follows Festinger (1954). The findings in the table of real evidence are real research results, rules and cases; the sources are listed below.</w:t>
             </w:r>
           </w:p>
         </w:tc>
@@ -3981,7 +4554,7 @@
           <w:color w:val="556274"/>
           <w:sz w:val="18"/>
         </w:rPr>
-        <w:t>Ryan &amp; Deci 2000 · Bandura 1977 · Festinger 1954</w:t>
+        <w:t>Ryan &amp; Deci 2000 · Bandura 1977 · Festinger 1954 · Kivetz et al. 2006</w:t>
       </w:r>
     </w:p>
     <w:p>
@@ -4633,6 +5206,319 @@
         <w:spacing w:before="0" w:after="80"/>
       </w:pPr>
     </w:p>
+    <w:p>
+      <w:pPr>
+        <w:spacing w:before="0" w:after="100"/>
+      </w:pPr>
+      <w:r>
+        <w:rPr>
+          <w:b/>
+        </w:rPr>
+        <w:t>The limits of the tools: evidence</w:t>
+      </w:r>
+    </w:p>
+    <w:tbl>
+      <w:tblPr>
+        <w:tblW w:w="9638" w:type="dxa"/>
+        <w:tblBorders>
+          <w:top w:val="single" w:sz="4" w:space="0" w:color="D5DEE9"/>
+          <w:left w:val="single" w:sz="4" w:space="0" w:color="D5DEE9"/>
+          <w:bottom w:val="single" w:sz="4" w:space="0" w:color="D5DEE9"/>
+          <w:right w:val="single" w:sz="4" w:space="0" w:color="D5DEE9"/>
+          <w:insideH w:val="single" w:sz="4" w:space="0" w:color="D5DEE9"/>
+          <w:insideV w:val="single" w:sz="4" w:space="0" w:color="D5DEE9"/>
+        </w:tblBorders>
+        <w:tblLayout w:type="fixed"/>
+        <w:tblCellMar>
+          <w:top w:w="60" w:type="dxa"/>
+          <w:left w:w="100" w:type="dxa"/>
+          <w:bottom w:w="60" w:type="dxa"/>
+          <w:right w:w="100" w:type="dxa"/>
+        </w:tblCellMar>
+      </w:tblPr>
+      <w:tblGrid>
+        <w:gridCol w:w="1739"/>
+        <w:gridCol w:w="4942"/>
+        <w:gridCol w:w="2957"/>
+      </w:tblGrid>
+      <w:tr>
+        <w:trPr>
+          <w:cantSplit/>
+          <w:tblHeader/>
+        </w:trPr>
+        <w:tc>
+          <w:tcPr>
+            <w:tcW w:type="dxa" w:w="1739"/>
+            <w:shd w:val="clear" w:color="auto" w:fill="E6ECF4"/>
+          </w:tcPr>
+          <w:p>
+            <w:pPr>
+              <w:spacing w:before="0" w:after="0"/>
+            </w:pPr>
+            <w:r>
+              <w:rPr>
+                <w:b/>
+                <w:sz w:val="20"/>
+              </w:rPr>
+              <w:t>Finding</w:t>
+            </w:r>
+          </w:p>
+        </w:tc>
+        <w:tc>
+          <w:tcPr>
+            <w:tcW w:type="dxa" w:w="4942"/>
+            <w:shd w:val="clear" w:color="auto" w:fill="E6ECF4"/>
+          </w:tcPr>
+          <w:p>
+            <w:pPr>
+              <w:spacing w:before="0" w:after="0"/>
+            </w:pPr>
+            <w:r>
+              <w:rPr>
+                <w:b/>
+                <w:sz w:val="20"/>
+              </w:rPr>
+              <w:t>What was measured</w:t>
+            </w:r>
+          </w:p>
+        </w:tc>
+        <w:tc>
+          <w:tcPr>
+            <w:tcW w:type="dxa" w:w="2957"/>
+            <w:shd w:val="clear" w:color="auto" w:fill="E6ECF4"/>
+          </w:tcPr>
+          <w:p>
+            <w:pPr>
+              <w:spacing w:before="0" w:after="0"/>
+            </w:pPr>
+            <w:r>
+              <w:rPr>
+                <w:b/>
+                <w:sz w:val="20"/>
+              </w:rPr>
+              <w:t>What it means for a mechanic</w:t>
+            </w:r>
+          </w:p>
+        </w:tc>
+      </w:tr>
+      <w:tr>
+        <w:trPr>
+          <w:cantSplit/>
+        </w:trPr>
+        <w:tc>
+          <w:tcPr>
+            <w:tcW w:type="dxa" w:w="1739"/>
+          </w:tcPr>
+          <w:p>
+            <w:pPr>
+              <w:spacing w:before="0" w:after="0"/>
+            </w:pPr>
+            <w:r>
+              <w:rPr>
+                <w:sz w:val="20"/>
+              </w:rPr>
+              <w:t>Rewards can undermine interest</w:t>
+            </w:r>
+          </w:p>
+        </w:tc>
+        <w:tc>
+          <w:tcPr>
+            <w:tcW w:type="dxa" w:w="4942"/>
+          </w:tcPr>
+          <w:p>
+            <w:pPr>
+              <w:spacing w:before="0" w:after="0"/>
+            </w:pPr>
+            <w:r>
+              <w:rPr>
+                <w:sz w:val="20"/>
+              </w:rPr>
+              <w:t>A meta-analysis of 128 experiments found that tangible rewards undermined intrinsic motivation (Deci et al. 1999).</w:t>
+            </w:r>
+          </w:p>
+        </w:tc>
+        <w:tc>
+          <w:tcPr>
+            <w:tcW w:type="dxa" w:w="2957"/>
+          </w:tcPr>
+          <w:p>
+            <w:pPr>
+              <w:spacing w:before="0" w:after="0"/>
+            </w:pPr>
+            <w:r>
+              <w:rPr>
+                <w:sz w:val="20"/>
+              </w:rPr>
+              <w:t>Do not pay for what people already do for its own sake.</w:t>
+            </w:r>
+          </w:p>
+        </w:tc>
+      </w:tr>
+      <w:tr>
+        <w:trPr>
+          <w:cantSplit/>
+        </w:trPr>
+        <w:tc>
+          <w:tcPr>
+            <w:tcW w:type="dxa" w:w="1739"/>
+          </w:tcPr>
+          <w:p>
+            <w:pPr>
+              <w:spacing w:before="0" w:after="0"/>
+            </w:pPr>
+            <w:r>
+              <w:rPr>
+                <w:sz w:val="20"/>
+              </w:rPr>
+              <w:t>Expected rewards</w:t>
+            </w:r>
+          </w:p>
+        </w:tc>
+        <w:tc>
+          <w:tcPr>
+            <w:tcW w:type="dxa" w:w="4942"/>
+          </w:tcPr>
+          <w:p>
+            <w:pPr>
+              <w:spacing w:before="0" w:after="0"/>
+            </w:pPr>
+            <w:r>
+              <w:rPr>
+                <w:sz w:val="20"/>
+              </w:rPr>
+              <w:t>Preschool children who liked drawing and were promised a certificate drew less in later free play than children who got the same certificate unexpectedly or none (Lepper et al. 1973; 18, 18 and 15 children, as reported).</w:t>
+            </w:r>
+          </w:p>
+        </w:tc>
+        <w:tc>
+          <w:tcPr>
+            <w:tcW w:type="dxa" w:w="2957"/>
+          </w:tcPr>
+          <w:p>
+            <w:pPr>
+              <w:spacing w:before="0" w:after="0"/>
+            </w:pPr>
+            <w:r>
+              <w:rPr>
+                <w:sz w:val="20"/>
+              </w:rPr>
+              <w:t>A reward that is announced turns the activity into a means to the reward.</w:t>
+            </w:r>
+          </w:p>
+        </w:tc>
+      </w:tr>
+      <w:tr>
+        <w:trPr>
+          <w:cantSplit/>
+        </w:trPr>
+        <w:tc>
+          <w:tcPr>
+            <w:tcW w:type="dxa" w:w="1739"/>
+          </w:tcPr>
+          <w:p>
+            <w:pPr>
+              <w:spacing w:before="0" w:after="0"/>
+            </w:pPr>
+            <w:r>
+              <w:rPr>
+                <w:sz w:val="20"/>
+              </w:rPr>
+              <w:t>Losses weigh more</w:t>
+            </w:r>
+          </w:p>
+        </w:tc>
+        <w:tc>
+          <w:tcPr>
+            <w:tcW w:type="dxa" w:w="4942"/>
+          </w:tcPr>
+          <w:p>
+            <w:pPr>
+              <w:spacing w:before="0" w:after="0"/>
+            </w:pPr>
+            <w:r>
+              <w:rPr>
+                <w:sz w:val="20"/>
+              </w:rPr>
+              <w:t>Losses loom larger than equal gains (Tversky and Kahneman 1991).</w:t>
+            </w:r>
+          </w:p>
+        </w:tc>
+        <w:tc>
+          <w:tcPr>
+            <w:tcW w:type="dxa" w:w="2957"/>
+          </w:tcPr>
+          <w:p>
+            <w:pPr>
+              <w:spacing w:before="0" w:after="0"/>
+            </w:pPr>
+            <w:r>
+              <w:rPr>
+                <w:sz w:val="20"/>
+              </w:rPr>
+              <w:t>A broken streak hurts more than a kept streak pleases: offer a way to recover.</w:t>
+            </w:r>
+          </w:p>
+        </w:tc>
+      </w:tr>
+      <w:tr>
+        <w:trPr>
+          <w:cantSplit/>
+        </w:trPr>
+        <w:tc>
+          <w:tcPr>
+            <w:tcW w:type="dxa" w:w="1739"/>
+          </w:tcPr>
+          <w:p>
+            <w:pPr>
+              <w:spacing w:before="0" w:after="0"/>
+            </w:pPr>
+            <w:r>
+              <w:rPr>
+                <w:sz w:val="20"/>
+              </w:rPr>
+              <w:t>Context decides</w:t>
+            </w:r>
+          </w:p>
+        </w:tc>
+        <w:tc>
+          <w:tcPr>
+            <w:tcW w:type="dxa" w:w="4942"/>
+          </w:tcPr>
+          <w:p>
+            <w:pPr>
+              <w:spacing w:before="0" w:after="0"/>
+            </w:pPr>
+            <w:r>
+              <w:rPr>
+                <w:sz w:val="20"/>
+              </w:rPr>
+              <w:t>The effects of gamification depended greatly on context and on users (Hamari et al. 2014).</w:t>
+            </w:r>
+          </w:p>
+        </w:tc>
+        <w:tc>
+          <w:tcPr>
+            <w:tcW w:type="dxa" w:w="2957"/>
+          </w:tcPr>
+          <w:p>
+            <w:pPr>
+              <w:spacing w:before="0" w:after="0"/>
+            </w:pPr>
+            <w:r>
+              <w:rPr>
+                <w:sz w:val="20"/>
+              </w:rPr>
+              <w:t>Test each tool in the setting where it will be used.</w:t>
+            </w:r>
+          </w:p>
+        </w:tc>
+      </w:tr>
+    </w:tbl>
+    <w:p>
+      <w:pPr>
+        <w:spacing w:before="0" w:after="80"/>
+      </w:pPr>
+    </w:p>
     <w:tbl>
       <w:tblPr>
         <w:tblW w:w="9598" w:type="dxa"/>
@@ -4682,7 +5568,7 @@
             </w:pPr>
             <w:r>
               <w:rPr/>
-              <w:t>Brightwater Savings, Vera, Kaspar, Rhea and Dominik are made up for this example. Mixed effects of gamification follow Hamari et al. (2014); rewards lowering intrinsic motivation follow Deci et al. (1999); loss aversion, the lever behind “don't lose your streak”, follows Tversky and Kahneman (1991).</w:t>
+              <w:t>Brightwater Savings, Vera, Kaspar, Rhea and Dominik are made up for this example. Mixed effects of gamification follow Hamari et al. (2014); rewards lowering intrinsic motivation follow Deci et al. (1999); loss aversion, the lever behind “don't lose your streak”, follows Tversky and Kahneman (1991). The findings in the table of real evidence are real research results, rules and cases; the sources are listed below.</w:t>
             </w:r>
           </w:p>
         </w:tc>
@@ -4871,7 +5757,7 @@
           <w:color w:val="556274"/>
           <w:sz w:val="18"/>
         </w:rPr>
-        <w:t>Hamari et al. 2014 · Deci et al. 1999 · Tversky &amp; Kahneman 1991</w:t>
+        <w:t>Hamari et al. 2014 · Deci et al. 1999 · Tversky &amp; Kahneman 1991 · Lepper et al. 1973</w:t>
       </w:r>
     </w:p>
     <w:p>
@@ -5106,6 +5992,266 @@
         <w:t>Figure 5 · Three Brightwater designs and the period you look at · a typical pattern, not data.</w:t>
       </w:r>
     </w:p>
+    <w:p>
+      <w:pPr>
+        <w:spacing w:before="0" w:after="100"/>
+      </w:pPr>
+      <w:r>
+        <w:rPr>
+          <w:b/>
+        </w:rPr>
+        <w:t>A quick spike against lasting use: a real trial</w:t>
+      </w:r>
+    </w:p>
+    <w:tbl>
+      <w:tblPr>
+        <w:tblW w:w="9638" w:type="dxa"/>
+        <w:tblBorders>
+          <w:top w:val="single" w:sz="4" w:space="0" w:color="D5DEE9"/>
+          <w:left w:val="single" w:sz="4" w:space="0" w:color="D5DEE9"/>
+          <w:bottom w:val="single" w:sz="4" w:space="0" w:color="D5DEE9"/>
+          <w:right w:val="single" w:sz="4" w:space="0" w:color="D5DEE9"/>
+          <w:insideH w:val="single" w:sz="4" w:space="0" w:color="D5DEE9"/>
+          <w:insideV w:val="single" w:sz="4" w:space="0" w:color="D5DEE9"/>
+        </w:tblBorders>
+        <w:tblLayout w:type="fixed"/>
+        <w:tblCellMar>
+          <w:top w:w="60" w:type="dxa"/>
+          <w:left w:w="100" w:type="dxa"/>
+          <w:bottom w:w="60" w:type="dxa"/>
+          <w:right w:w="100" w:type="dxa"/>
+        </w:tblCellMar>
+      </w:tblPr>
+      <w:tblGrid>
+        <w:gridCol w:w="1441"/>
+        <w:gridCol w:w="5226"/>
+        <w:gridCol w:w="2971"/>
+      </w:tblGrid>
+      <w:tr>
+        <w:trPr>
+          <w:cantSplit/>
+          <w:tblHeader/>
+        </w:trPr>
+        <w:tc>
+          <w:tcPr>
+            <w:tcW w:type="dxa" w:w="1441"/>
+            <w:shd w:val="clear" w:color="auto" w:fill="E6ECF4"/>
+          </w:tcPr>
+          <w:p>
+            <w:pPr>
+              <w:spacing w:before="0" w:after="0"/>
+            </w:pPr>
+            <w:r>
+              <w:rPr>
+                <w:b/>
+                <w:sz w:val="20"/>
+              </w:rPr>
+              <w:t>Finding</w:t>
+            </w:r>
+          </w:p>
+        </w:tc>
+        <w:tc>
+          <w:tcPr>
+            <w:tcW w:type="dxa" w:w="5226"/>
+            <w:shd w:val="clear" w:color="auto" w:fill="E6ECF4"/>
+          </w:tcPr>
+          <w:p>
+            <w:pPr>
+              <w:spacing w:before="0" w:after="0"/>
+            </w:pPr>
+            <w:r>
+              <w:rPr>
+                <w:b/>
+                <w:sz w:val="20"/>
+              </w:rPr>
+              <w:t>What was measured</w:t>
+            </w:r>
+          </w:p>
+        </w:tc>
+        <w:tc>
+          <w:tcPr>
+            <w:tcW w:type="dxa" w:w="2971"/>
+            <w:shd w:val="clear" w:color="auto" w:fill="E6ECF4"/>
+          </w:tcPr>
+          <w:p>
+            <w:pPr>
+              <w:spacing w:before="0" w:after="0"/>
+            </w:pPr>
+            <w:r>
+              <w:rPr>
+                <w:b/>
+                <w:sz w:val="20"/>
+              </w:rPr>
+              <w:t>What it means for a mechanic</w:t>
+            </w:r>
+          </w:p>
+        </w:tc>
+      </w:tr>
+      <w:tr>
+        <w:trPr>
+          <w:cantSplit/>
+        </w:trPr>
+        <w:tc>
+          <w:tcPr>
+            <w:tcW w:type="dxa" w:w="1441"/>
+          </w:tcPr>
+          <w:p>
+            <w:pPr>
+              <w:spacing w:before="0" w:after="0"/>
+            </w:pPr>
+            <w:r>
+              <w:rPr>
+                <w:sz w:val="20"/>
+              </w:rPr>
+              <w:t>A real trial</w:t>
+            </w:r>
+          </w:p>
+        </w:tc>
+        <w:tc>
+          <w:tcPr>
+            <w:tcW w:type="dxa" w:w="5226"/>
+          </w:tcPr>
+          <w:p>
+            <w:pPr>
+              <w:spacing w:before="0" w:after="0"/>
+            </w:pPr>
+            <w:r>
+              <w:rPr>
+                <w:sz w:val="20"/>
+              </w:rPr>
+              <w:t>In the BE FIT randomized trial, 200 adults of 94 families played a game with points and levels based on step goals for 12 weeks; their steps rose by 1,661 a day against 636 in the control group (Patel et al. 2017, as reported).</w:t>
+            </w:r>
+          </w:p>
+        </w:tc>
+        <w:tc>
+          <w:tcPr>
+            <w:tcW w:type="dxa" w:w="2971"/>
+          </w:tcPr>
+          <w:p>
+            <w:pPr>
+              <w:spacing w:before="0" w:after="0"/>
+            </w:pPr>
+            <w:r>
+              <w:rPr>
+                <w:sz w:val="20"/>
+              </w:rPr>
+              <w:t>A mechanic that is built around a real goal can move behaviour.</w:t>
+            </w:r>
+          </w:p>
+        </w:tc>
+      </w:tr>
+      <w:tr>
+        <w:trPr>
+          <w:cantSplit/>
+        </w:trPr>
+        <w:tc>
+          <w:tcPr>
+            <w:tcW w:type="dxa" w:w="1441"/>
+          </w:tcPr>
+          <w:p>
+            <w:pPr>
+              <w:spacing w:before="0" w:after="0"/>
+            </w:pPr>
+            <w:r>
+              <w:rPr>
+                <w:sz w:val="20"/>
+              </w:rPr>
+              <w:t>After the game</w:t>
+            </w:r>
+          </w:p>
+        </w:tc>
+        <w:tc>
+          <w:tcPr>
+            <w:tcW w:type="dxa" w:w="5226"/>
+          </w:tcPr>
+          <w:p>
+            <w:pPr>
+              <w:spacing w:before="0" w:after="0"/>
+            </w:pPr>
+            <w:r>
+              <w:rPr>
+                <w:sz w:val="20"/>
+              </w:rPr>
+              <w:t>In the 12 weeks after the game, the gain shrank to 1,385 against 798 steps, still above the control group (Patel et al. 2017, as reported).</w:t>
+            </w:r>
+          </w:p>
+        </w:tc>
+        <w:tc>
+          <w:tcPr>
+            <w:tcW w:type="dxa" w:w="2971"/>
+          </w:tcPr>
+          <w:p>
+            <w:pPr>
+              <w:spacing w:before="0" w:after="0"/>
+            </w:pPr>
+            <w:r>
+              <w:rPr>
+                <w:sz w:val="20"/>
+              </w:rPr>
+              <w:t>Plan for the decay: a mechanic needs a renewal or a hand-over to a habit.</w:t>
+            </w:r>
+          </w:p>
+        </w:tc>
+      </w:tr>
+      <w:tr>
+        <w:trPr>
+          <w:cantSplit/>
+        </w:trPr>
+        <w:tc>
+          <w:tcPr>
+            <w:tcW w:type="dxa" w:w="1441"/>
+          </w:tcPr>
+          <w:p>
+            <w:pPr>
+              <w:spacing w:before="0" w:after="0"/>
+            </w:pPr>
+            <w:r>
+              <w:rPr>
+                <w:sz w:val="20"/>
+              </w:rPr>
+              <w:t>Progress and story</w:t>
+            </w:r>
+          </w:p>
+        </w:tc>
+        <w:tc>
+          <w:tcPr>
+            <w:tcW w:type="dxa" w:w="5226"/>
+          </w:tcPr>
+          <w:p>
+            <w:pPr>
+              <w:spacing w:before="0" w:after="0"/>
+            </w:pPr>
+            <w:r>
+              <w:rPr>
+                <w:sz w:val="20"/>
+              </w:rPr>
+              <w:t>Perceived distance to the goal drives effort (Kivetz et al. 2006), and a narrative frame carries a person through a long path (Nicholson 2015).</w:t>
+            </w:r>
+          </w:p>
+        </w:tc>
+        <w:tc>
+          <w:tcPr>
+            <w:tcW w:type="dxa" w:w="2971"/>
+          </w:tcPr>
+          <w:p>
+            <w:pPr>
+              <w:spacing w:before="0" w:after="0"/>
+            </w:pPr>
+            <w:r>
+              <w:rPr>
+                <w:sz w:val="20"/>
+              </w:rPr>
+              <w:t>Use the story to explain why the goal matters and the progress to show the way.</w:t>
+            </w:r>
+          </w:p>
+        </w:tc>
+      </w:tr>
+    </w:tbl>
+    <w:p>
+      <w:pPr>
+        <w:spacing w:before="0" w:after="80"/>
+      </w:pPr>
+    </w:p>
     <w:tbl>
       <w:tblPr>
         <w:tblW w:w="9598" w:type="dxa"/>
@@ -5155,7 +6301,7 @@
             </w:pPr>
             <w:r>
               <w:rPr/>
-              <w:t>Brightwater Savings, Vera, Kaspar, Rhea and Dominik are made up for this example. Meaningful gamification built on the person's own goals follows Nicholson (2015); people speeding up as a goal comes closer follows Kivetz et al. (2006). The bars in the second picture are a typical pattern to think with, not measured data.</w:t>
+              <w:t>Brightwater Savings, Vera, Kaspar, Rhea and Dominik are made up for this example. Meaningful gamification built on the person's own goals follows Nicholson (2015); people speeding up as a goal comes closer follows Kivetz et al. (2006). The bars in the second picture are a typical pattern to think with, not measured data. The findings in the table of real evidence are real research results, rules and cases; the sources are listed below.</w:t>
             </w:r>
           </w:p>
         </w:tc>
@@ -5344,7 +6490,7 @@
           <w:color w:val="556274"/>
           <w:sz w:val="18"/>
         </w:rPr>
-        <w:t>Nicholson 2015 · Kivetz et al. 2006 · Ryan &amp; Deci 2000</w:t>
+        <w:t>Nicholson 2015 · Kivetz et al. 2006 · Ryan &amp; Deci 2000 · Patel et al. 2017</w:t>
       </w:r>
     </w:p>
     <w:p>
@@ -5579,6 +6725,266 @@
         <w:t>Figure 7 · Brightwater weighs three measures on effect on users, feasibility, risk and time pressure.</w:t>
       </w:r>
     </w:p>
+    <w:p>
+      <w:pPr>
+        <w:spacing w:before="0" w:after="100"/>
+      </w:pPr>
+      <w:r>
+        <w:rPr>
+          <w:b/>
+        </w:rPr>
+        <w:t>Intrinsic motivation and credible gamification in serious fields</w:t>
+      </w:r>
+    </w:p>
+    <w:tbl>
+      <w:tblPr>
+        <w:tblW w:w="9638" w:type="dxa"/>
+        <w:tblBorders>
+          <w:top w:val="single" w:sz="4" w:space="0" w:color="D5DEE9"/>
+          <w:left w:val="single" w:sz="4" w:space="0" w:color="D5DEE9"/>
+          <w:bottom w:val="single" w:sz="4" w:space="0" w:color="D5DEE9"/>
+          <w:right w:val="single" w:sz="4" w:space="0" w:color="D5DEE9"/>
+          <w:insideH w:val="single" w:sz="4" w:space="0" w:color="D5DEE9"/>
+          <w:insideV w:val="single" w:sz="4" w:space="0" w:color="D5DEE9"/>
+        </w:tblBorders>
+        <w:tblLayout w:type="fixed"/>
+        <w:tblCellMar>
+          <w:top w:w="60" w:type="dxa"/>
+          <w:left w:w="100" w:type="dxa"/>
+          <w:bottom w:w="60" w:type="dxa"/>
+          <w:right w:w="100" w:type="dxa"/>
+        </w:tblCellMar>
+      </w:tblPr>
+      <w:tblGrid>
+        <w:gridCol w:w="1819"/>
+        <w:gridCol w:w="4668"/>
+        <w:gridCol w:w="3151"/>
+      </w:tblGrid>
+      <w:tr>
+        <w:trPr>
+          <w:cantSplit/>
+          <w:tblHeader/>
+        </w:trPr>
+        <w:tc>
+          <w:tcPr>
+            <w:tcW w:type="dxa" w:w="1819"/>
+            <w:shd w:val="clear" w:color="auto" w:fill="E6ECF4"/>
+          </w:tcPr>
+          <w:p>
+            <w:pPr>
+              <w:spacing w:before="0" w:after="0"/>
+            </w:pPr>
+            <w:r>
+              <w:rPr>
+                <w:b/>
+                <w:sz w:val="20"/>
+              </w:rPr>
+              <w:t>Topic</w:t>
+            </w:r>
+          </w:p>
+        </w:tc>
+        <w:tc>
+          <w:tcPr>
+            <w:tcW w:type="dxa" w:w="4668"/>
+            <w:shd w:val="clear" w:color="auto" w:fill="E6ECF4"/>
+          </w:tcPr>
+          <w:p>
+            <w:pPr>
+              <w:spacing w:before="0" w:after="0"/>
+            </w:pPr>
+            <w:r>
+              <w:rPr>
+                <w:b/>
+                <w:sz w:val="20"/>
+              </w:rPr>
+              <w:t>Real finding or rule</w:t>
+            </w:r>
+          </w:p>
+        </w:tc>
+        <w:tc>
+          <w:tcPr>
+            <w:tcW w:type="dxa" w:w="3151"/>
+            <w:shd w:val="clear" w:color="auto" w:fill="E6ECF4"/>
+          </w:tcPr>
+          <w:p>
+            <w:pPr>
+              <w:spacing w:before="0" w:after="0"/>
+            </w:pPr>
+            <w:r>
+              <w:rPr>
+                <w:b/>
+                <w:sz w:val="20"/>
+              </w:rPr>
+              <w:t>What it means for a measure</w:t>
+            </w:r>
+          </w:p>
+        </w:tc>
+      </w:tr>
+      <w:tr>
+        <w:trPr>
+          <w:cantSplit/>
+        </w:trPr>
+        <w:tc>
+          <w:tcPr>
+            <w:tcW w:type="dxa" w:w="1819"/>
+          </w:tcPr>
+          <w:p>
+            <w:pPr>
+              <w:spacing w:before="0" w:after="0"/>
+            </w:pPr>
+            <w:r>
+              <w:rPr>
+                <w:sz w:val="20"/>
+              </w:rPr>
+              <w:t>Intrinsic motivation</w:t>
+            </w:r>
+          </w:p>
+        </w:tc>
+        <w:tc>
+          <w:tcPr>
+            <w:tcW w:type="dxa" w:w="4668"/>
+          </w:tcPr>
+          <w:p>
+            <w:pPr>
+              <w:spacing w:before="0" w:after="0"/>
+            </w:pPr>
+            <w:r>
+              <w:rPr>
+                <w:sz w:val="20"/>
+              </w:rPr>
+              <w:t>Rewards for an activity people already enjoy can reduce their interest (Deci et al. 1999; Lepper et al. 1973).</w:t>
+            </w:r>
+          </w:p>
+        </w:tc>
+        <w:tc>
+          <w:tcPr>
+            <w:tcW w:type="dxa" w:w="3151"/>
+          </w:tcPr>
+          <w:p>
+            <w:pPr>
+              <w:spacing w:before="0" w:after="0"/>
+            </w:pPr>
+            <w:r>
+              <w:rPr>
+                <w:sz w:val="20"/>
+              </w:rPr>
+              <w:t>Give feedback and recognition for progress and skill; keep rewards for tasks people do not enjoy.</w:t>
+            </w:r>
+          </w:p>
+        </w:tc>
+      </w:tr>
+      <w:tr>
+        <w:trPr>
+          <w:cantSplit/>
+        </w:trPr>
+        <w:tc>
+          <w:tcPr>
+            <w:tcW w:type="dxa" w:w="1819"/>
+          </w:tcPr>
+          <w:p>
+            <w:pPr>
+              <w:spacing w:before="0" w:after="0"/>
+            </w:pPr>
+            <w:r>
+              <w:rPr>
+                <w:sz w:val="20"/>
+              </w:rPr>
+              <w:t>A serious field</w:t>
+            </w:r>
+          </w:p>
+        </w:tc>
+        <w:tc>
+          <w:tcPr>
+            <w:tcW w:type="dxa" w:w="4668"/>
+          </w:tcPr>
+          <w:p>
+            <w:pPr>
+              <w:spacing w:before="0" w:after="0"/>
+            </w:pPr>
+            <w:r>
+              <w:rPr>
+                <w:sz w:val="20"/>
+              </w:rPr>
+              <w:t>A game-based intervention with social incentives raised the daily steps of families in a community study of a heart health programme (Patel et al. 2017, as reported).</w:t>
+            </w:r>
+          </w:p>
+        </w:tc>
+        <w:tc>
+          <w:tcPr>
+            <w:tcW w:type="dxa" w:w="3151"/>
+          </w:tcPr>
+          <w:p>
+            <w:pPr>
+              <w:spacing w:before="0" w:after="0"/>
+            </w:pPr>
+            <w:r>
+              <w:rPr>
+                <w:sz w:val="20"/>
+              </w:rPr>
+              <w:t>In health and finance, a mechanic is credible when it serves a goal the person has and is evaluated.</w:t>
+            </w:r>
+          </w:p>
+        </w:tc>
+      </w:tr>
+      <w:tr>
+        <w:trPr>
+          <w:cantSplit/>
+        </w:trPr>
+        <w:tc>
+          <w:tcPr>
+            <w:tcW w:type="dxa" w:w="1819"/>
+          </w:tcPr>
+          <w:p>
+            <w:pPr>
+              <w:spacing w:before="0" w:after="0"/>
+            </w:pPr>
+            <w:r>
+              <w:rPr>
+                <w:sz w:val="20"/>
+              </w:rPr>
+              <w:t>Manipulation</w:t>
+            </w:r>
+          </w:p>
+        </w:tc>
+        <w:tc>
+          <w:tcPr>
+            <w:tcW w:type="dxa" w:w="4668"/>
+          </w:tcPr>
+          <w:p>
+            <w:pPr>
+              <w:spacing w:before="0" w:after="0"/>
+            </w:pPr>
+            <w:r>
+              <w:rPr>
+                <w:sz w:val="20"/>
+              </w:rPr>
+              <w:t>Pressure patterns such as countdown timers and false scarcity were found on about 11% of the crawled shopping websites (Mathur et al. 2019), and the EU Digital Services Act (Article 25) forbids manipulative interface design on online platforms.</w:t>
+            </w:r>
+          </w:p>
+        </w:tc>
+        <w:tc>
+          <w:tcPr>
+            <w:tcW w:type="dxa" w:w="3151"/>
+          </w:tcPr>
+          <w:p>
+            <w:pPr>
+              <w:spacing w:before="0" w:after="0"/>
+            </w:pPr>
+            <w:r>
+              <w:rPr>
+                <w:sz w:val="20"/>
+              </w:rPr>
+              <w:t>A mechanic that pushes people against their interest is a legal risk and a loss of trust.</w:t>
+            </w:r>
+          </w:p>
+        </w:tc>
+      </w:tr>
+    </w:tbl>
+    <w:p>
+      <w:pPr>
+        <w:spacing w:before="0" w:after="80"/>
+      </w:pPr>
+    </w:p>
     <w:tbl>
       <w:tblPr>
         <w:tblW w:w="9598" w:type="dxa"/>
@@ -5628,7 +7034,7 @@
             </w:pPr>
             <w:r>
               <w:rPr/>
-              <w:t>Brightwater Savings, Vera, Kaspar, Rhea and Dominik are made up for this example. The overjustification effect follows Lepper et al. (1973) and Deci et al. (1999); rating options on the same criteria with a reason follows Gibbons (2018). The four criteria are the ones the plan names for the case study.</w:t>
+              <w:t>Brightwater Savings, Vera, Kaspar, Rhea and Dominik are made up for this example. The overjustification effect follows Lepper et al. (1973) and Deci et al. (1999); rating options on the same criteria with a reason follows Gibbons (2018). The four criteria are the ones the plan names for the case study. The findings in the table of real evidence are real research results, rules and cases; the sources are listed below.</w:t>
             </w:r>
           </w:p>
         </w:tc>
@@ -5817,7 +7223,7 @@
           <w:color w:val="556274"/>
           <w:sz w:val="18"/>
         </w:rPr>
-        <w:t>Lepper et al. 1973 · Deci et al. 1999 · Gibbons 2018</w:t>
+        <w:t>Lepper et al. 1973 · Deci et al. 1999 · Gibbons 2018 · Patel et al. 2017 · Mathur et al. 2019 · EU Digital Services Act</w:t>
       </w:r>
     </w:p>
     <w:p>
@@ -6124,6 +7530,266 @@
         <w:t>Figure 9 · The layers of an activation architecture, from a guiding vision to every touchpoint.</w:t>
       </w:r>
     </w:p>
+    <w:p>
+      <w:pPr>
+        <w:spacing w:before="0" w:after="100"/>
+      </w:pPr>
+      <w:r>
+        <w:rPr>
+          <w:b/>
+        </w:rPr>
+        <w:t>Gamification as an activation architecture: evidence</w:t>
+      </w:r>
+    </w:p>
+    <w:tbl>
+      <w:tblPr>
+        <w:tblW w:w="9638" w:type="dxa"/>
+        <w:tblBorders>
+          <w:top w:val="single" w:sz="4" w:space="0" w:color="D5DEE9"/>
+          <w:left w:val="single" w:sz="4" w:space="0" w:color="D5DEE9"/>
+          <w:bottom w:val="single" w:sz="4" w:space="0" w:color="D5DEE9"/>
+          <w:right w:val="single" w:sz="4" w:space="0" w:color="D5DEE9"/>
+          <w:insideH w:val="single" w:sz="4" w:space="0" w:color="D5DEE9"/>
+          <w:insideV w:val="single" w:sz="4" w:space="0" w:color="D5DEE9"/>
+        </w:tblBorders>
+        <w:tblLayout w:type="fixed"/>
+        <w:tblCellMar>
+          <w:top w:w="60" w:type="dxa"/>
+          <w:left w:w="100" w:type="dxa"/>
+          <w:bottom w:w="60" w:type="dxa"/>
+          <w:right w:w="100" w:type="dxa"/>
+        </w:tblCellMar>
+      </w:tblPr>
+      <w:tblGrid>
+        <w:gridCol w:w="1749"/>
+        <w:gridCol w:w="4582"/>
+        <w:gridCol w:w="3307"/>
+      </w:tblGrid>
+      <w:tr>
+        <w:trPr>
+          <w:cantSplit/>
+          <w:tblHeader/>
+        </w:trPr>
+        <w:tc>
+          <w:tcPr>
+            <w:tcW w:type="dxa" w:w="1749"/>
+            <w:shd w:val="clear" w:color="auto" w:fill="E6ECF4"/>
+          </w:tcPr>
+          <w:p>
+            <w:pPr>
+              <w:spacing w:before="0" w:after="0"/>
+            </w:pPr>
+            <w:r>
+              <w:rPr>
+                <w:b/>
+                <w:sz w:val="20"/>
+              </w:rPr>
+              <w:t>Part</w:t>
+            </w:r>
+          </w:p>
+        </w:tc>
+        <w:tc>
+          <w:tcPr>
+            <w:tcW w:type="dxa" w:w="4582"/>
+            <w:shd w:val="clear" w:color="auto" w:fill="E6ECF4"/>
+          </w:tcPr>
+          <w:p>
+            <w:pPr>
+              <w:spacing w:before="0" w:after="0"/>
+            </w:pPr>
+            <w:r>
+              <w:rPr>
+                <w:b/>
+                <w:sz w:val="20"/>
+              </w:rPr>
+              <w:t>Real finding</w:t>
+            </w:r>
+          </w:p>
+        </w:tc>
+        <w:tc>
+          <w:tcPr>
+            <w:tcW w:type="dxa" w:w="3307"/>
+            <w:shd w:val="clear" w:color="auto" w:fill="E6ECF4"/>
+          </w:tcPr>
+          <w:p>
+            <w:pPr>
+              <w:spacing w:before="0" w:after="0"/>
+            </w:pPr>
+            <w:r>
+              <w:rPr>
+                <w:b/>
+                <w:sz w:val="20"/>
+              </w:rPr>
+              <w:t>What it means</w:t>
+            </w:r>
+          </w:p>
+        </w:tc>
+      </w:tr>
+      <w:tr>
+        <w:trPr>
+          <w:cantSplit/>
+        </w:trPr>
+        <w:tc>
+          <w:tcPr>
+            <w:tcW w:type="dxa" w:w="1749"/>
+          </w:tcPr>
+          <w:p>
+            <w:pPr>
+              <w:spacing w:before="0" w:after="0"/>
+            </w:pPr>
+            <w:r>
+              <w:rPr>
+                <w:sz w:val="20"/>
+              </w:rPr>
+              <w:t>Context decides</w:t>
+            </w:r>
+          </w:p>
+        </w:tc>
+        <w:tc>
+          <w:tcPr>
+            <w:tcW w:type="dxa" w:w="4582"/>
+          </w:tcPr>
+          <w:p>
+            <w:pPr>
+              <w:spacing w:before="0" w:after="0"/>
+            </w:pPr>
+            <w:r>
+              <w:rPr>
+                <w:sz w:val="20"/>
+              </w:rPr>
+              <w:t>The effects of gamification depended greatly on the context and the users (Hamari et al. 2014).</w:t>
+            </w:r>
+          </w:p>
+        </w:tc>
+        <w:tc>
+          <w:tcPr>
+            <w:tcW w:type="dxa" w:w="3307"/>
+          </w:tcPr>
+          <w:p>
+            <w:pPr>
+              <w:spacing w:before="0" w:after="0"/>
+            </w:pPr>
+            <w:r>
+              <w:rPr>
+                <w:sz w:val="20"/>
+              </w:rPr>
+              <w:t>An activation strategy names the context and the group before it names a mechanic.</w:t>
+            </w:r>
+          </w:p>
+        </w:tc>
+      </w:tr>
+      <w:tr>
+        <w:trPr>
+          <w:cantSplit/>
+        </w:trPr>
+        <w:tc>
+          <w:tcPr>
+            <w:tcW w:type="dxa" w:w="1749"/>
+          </w:tcPr>
+          <w:p>
+            <w:pPr>
+              <w:spacing w:before="0" w:after="0"/>
+            </w:pPr>
+            <w:r>
+              <w:rPr>
+                <w:sz w:val="20"/>
+              </w:rPr>
+              <w:t>A design framework</w:t>
+            </w:r>
+          </w:p>
+        </w:tc>
+        <w:tc>
+          <w:tcPr>
+            <w:tcW w:type="dxa" w:w="4582"/>
+          </w:tcPr>
+          <w:p>
+            <w:pPr>
+              <w:spacing w:before="0" w:after="0"/>
+            </w:pPr>
+            <w:r>
+              <w:rPr>
+                <w:sz w:val="20"/>
+              </w:rPr>
+              <w:t>Nicholson's framework for meaningful gamification starts with the user's own purposes and lets the user choose how to take part (Nicholson 2015).</w:t>
+            </w:r>
+          </w:p>
+        </w:tc>
+        <w:tc>
+          <w:tcPr>
+            <w:tcW w:type="dxa" w:w="3307"/>
+          </w:tcPr>
+          <w:p>
+            <w:pPr>
+              <w:spacing w:before="0" w:after="0"/>
+            </w:pPr>
+            <w:r>
+              <w:rPr>
+                <w:sz w:val="20"/>
+              </w:rPr>
+              <w:t>Build the architecture from the goal outwards, not from the game layer inwards.</w:t>
+            </w:r>
+          </w:p>
+        </w:tc>
+      </w:tr>
+      <w:tr>
+        <w:trPr>
+          <w:cantSplit/>
+        </w:trPr>
+        <w:tc>
+          <w:tcPr>
+            <w:tcW w:type="dxa" w:w="1749"/>
+          </w:tcPr>
+          <w:p>
+            <w:pPr>
+              <w:spacing w:before="0" w:after="0"/>
+            </w:pPr>
+            <w:r>
+              <w:rPr>
+                <w:sz w:val="20"/>
+              </w:rPr>
+              <w:t>Evidence of effect and decay</w:t>
+            </w:r>
+          </w:p>
+        </w:tc>
+        <w:tc>
+          <w:tcPr>
+            <w:tcW w:type="dxa" w:w="4582"/>
+          </w:tcPr>
+          <w:p>
+            <w:pPr>
+              <w:spacing w:before="0" w:after="0"/>
+            </w:pPr>
+            <w:r>
+              <w:rPr>
+                <w:sz w:val="20"/>
+              </w:rPr>
+              <w:t>A trial showed a clear effect during the game and a smaller one after it (Patel et al. 2017, as reported).</w:t>
+            </w:r>
+          </w:p>
+        </w:tc>
+        <w:tc>
+          <w:tcPr>
+            <w:tcW w:type="dxa" w:w="3307"/>
+          </w:tcPr>
+          <w:p>
+            <w:pPr>
+              <w:spacing w:before="0" w:after="0"/>
+            </w:pPr>
+            <w:r>
+              <w:rPr>
+                <w:sz w:val="20"/>
+              </w:rPr>
+              <w:t>Plan the phases: start, hold, hand over.</w:t>
+            </w:r>
+          </w:p>
+        </w:tc>
+      </w:tr>
+    </w:tbl>
+    <w:p>
+      <w:pPr>
+        <w:spacing w:before="0" w:after="80"/>
+      </w:pPr>
+    </w:p>
     <w:tbl>
       <w:tblPr>
         <w:tblW w:w="9598" w:type="dxa"/>
@@ -6173,7 +7839,7 @@
             </w:pPr>
             <w:r>
               <w:rPr/>
-              <w:t>Brightwater Savings, Vera, Kaspar, Rhea and Dominik are made up for this example. Lasting motivation through competence and autonomy follows Ryan and Deci (2000); meaningful gamification follows Nicholson (2015).</w:t>
+              <w:t>Brightwater Savings, Vera, Kaspar, Rhea and Dominik are made up for this example. Lasting motivation through competence and autonomy follows Ryan and Deci (2000); meaningful gamification follows Nicholson (2015). The findings in the table of real evidence are real research results, rules and cases; the sources are listed below.</w:t>
             </w:r>
           </w:p>
         </w:tc>
@@ -6362,7 +8028,7 @@
           <w:color w:val="556274"/>
           <w:sz w:val="18"/>
         </w:rPr>
-        <w:t>Nicholson 2015 · Ryan &amp; Deci 2000 · Hamari et al. 2014</w:t>
+        <w:t>Nicholson 2015 · Ryan &amp; Deci 2000 · Hamari et al. 2014 · Patel et al. 2017</w:t>
       </w:r>
     </w:p>
     <w:p>
@@ -6855,6 +8521,266 @@
         <w:spacing w:before="0" w:after="80"/>
       </w:pPr>
     </w:p>
+    <w:p>
+      <w:pPr>
+        <w:spacing w:before="0" w:after="100"/>
+      </w:pPr>
+      <w:r>
+        <w:rPr>
+          <w:b/>
+        </w:rPr>
+        <w:t>Conflicts of activation, with evidence</w:t>
+      </w:r>
+    </w:p>
+    <w:tbl>
+      <w:tblPr>
+        <w:tblW w:w="9638" w:type="dxa"/>
+        <w:tblBorders>
+          <w:top w:val="single" w:sz="4" w:space="0" w:color="D5DEE9"/>
+          <w:left w:val="single" w:sz="4" w:space="0" w:color="D5DEE9"/>
+          <w:bottom w:val="single" w:sz="4" w:space="0" w:color="D5DEE9"/>
+          <w:right w:val="single" w:sz="4" w:space="0" w:color="D5DEE9"/>
+          <w:insideH w:val="single" w:sz="4" w:space="0" w:color="D5DEE9"/>
+          <w:insideV w:val="single" w:sz="4" w:space="0" w:color="D5DEE9"/>
+        </w:tblBorders>
+        <w:tblLayout w:type="fixed"/>
+        <w:tblCellMar>
+          <w:top w:w="60" w:type="dxa"/>
+          <w:left w:w="100" w:type="dxa"/>
+          <w:bottom w:w="60" w:type="dxa"/>
+          <w:right w:w="100" w:type="dxa"/>
+        </w:tblCellMar>
+      </w:tblPr>
+      <w:tblGrid>
+        <w:gridCol w:w="2120"/>
+        <w:gridCol w:w="4854"/>
+        <w:gridCol w:w="2664"/>
+      </w:tblGrid>
+      <w:tr>
+        <w:trPr>
+          <w:cantSplit/>
+          <w:tblHeader/>
+        </w:trPr>
+        <w:tc>
+          <w:tcPr>
+            <w:tcW w:type="dxa" w:w="2120"/>
+            <w:shd w:val="clear" w:color="auto" w:fill="E6ECF4"/>
+          </w:tcPr>
+          <w:p>
+            <w:pPr>
+              <w:spacing w:before="0" w:after="0"/>
+            </w:pPr>
+            <w:r>
+              <w:rPr>
+                <w:b/>
+                <w:sz w:val="20"/>
+              </w:rPr>
+              <w:t>Conflict</w:t>
+            </w:r>
+          </w:p>
+        </w:tc>
+        <w:tc>
+          <w:tcPr>
+            <w:tcW w:type="dxa" w:w="4854"/>
+            <w:shd w:val="clear" w:color="auto" w:fill="E6ECF4"/>
+          </w:tcPr>
+          <w:p>
+            <w:pPr>
+              <w:spacing w:before="0" w:after="0"/>
+            </w:pPr>
+            <w:r>
+              <w:rPr>
+                <w:b/>
+                <w:sz w:val="20"/>
+              </w:rPr>
+              <w:t>What the evidence says</w:t>
+            </w:r>
+          </w:p>
+        </w:tc>
+        <w:tc>
+          <w:tcPr>
+            <w:tcW w:type="dxa" w:w="2664"/>
+            <w:shd w:val="clear" w:color="auto" w:fill="E6ECF4"/>
+          </w:tcPr>
+          <w:p>
+            <w:pPr>
+              <w:spacing w:before="0" w:after="0"/>
+            </w:pPr>
+            <w:r>
+              <w:rPr>
+                <w:b/>
+                <w:sz w:val="20"/>
+              </w:rPr>
+              <w:t>A way to decide</w:t>
+            </w:r>
+          </w:p>
+        </w:tc>
+      </w:tr>
+      <w:tr>
+        <w:trPr>
+          <w:cantSplit/>
+        </w:trPr>
+        <w:tc>
+          <w:tcPr>
+            <w:tcW w:type="dxa" w:w="2120"/>
+          </w:tcPr>
+          <w:p>
+            <w:pPr>
+              <w:spacing w:before="0" w:after="0"/>
+            </w:pPr>
+            <w:r>
+              <w:rPr>
+                <w:sz w:val="20"/>
+              </w:rPr>
+              <w:t>Motivation against seriousness</w:t>
+            </w:r>
+          </w:p>
+        </w:tc>
+        <w:tc>
+          <w:tcPr>
+            <w:tcW w:type="dxa" w:w="4854"/>
+          </w:tcPr>
+          <w:p>
+            <w:pPr>
+              <w:spacing w:before="0" w:after="0"/>
+            </w:pPr>
+            <w:r>
+              <w:rPr>
+                <w:sz w:val="20"/>
+              </w:rPr>
+              <w:t>Gamification worked in a trial about health (Patel et al. 2017, as reported), but effects depend on context (Hamari et al. 2014).</w:t>
+            </w:r>
+          </w:p>
+        </w:tc>
+        <w:tc>
+          <w:tcPr>
+            <w:tcW w:type="dxa" w:w="2664"/>
+          </w:tcPr>
+          <w:p>
+            <w:pPr>
+              <w:spacing w:before="0" w:after="0"/>
+            </w:pPr>
+            <w:r>
+              <w:rPr>
+                <w:sz w:val="20"/>
+              </w:rPr>
+              <w:t>Test lively elements in the serious setting with its users before scaling.</w:t>
+            </w:r>
+          </w:p>
+        </w:tc>
+      </w:tr>
+      <w:tr>
+        <w:trPr>
+          <w:cantSplit/>
+        </w:trPr>
+        <w:tc>
+          <w:tcPr>
+            <w:tcW w:type="dxa" w:w="2120"/>
+          </w:tcPr>
+          <w:p>
+            <w:pPr>
+              <w:spacing w:before="0" w:after="0"/>
+            </w:pPr>
+            <w:r>
+              <w:rPr>
+                <w:sz w:val="20"/>
+              </w:rPr>
+              <w:t>Activation against autonomy</w:t>
+            </w:r>
+          </w:p>
+        </w:tc>
+        <w:tc>
+          <w:tcPr>
+            <w:tcW w:type="dxa" w:w="4854"/>
+          </w:tcPr>
+          <w:p>
+            <w:pPr>
+              <w:spacing w:before="0" w:after="0"/>
+            </w:pPr>
+            <w:r>
+              <w:rPr>
+                <w:sz w:val="20"/>
+              </w:rPr>
+              <w:t>Autonomy is one of the three basic needs for lasting motivation (Ryan and Deci 2000), and announced rewards can undermine interest (Deci et al. 1999).</w:t>
+            </w:r>
+          </w:p>
+        </w:tc>
+        <w:tc>
+          <w:tcPr>
+            <w:tcW w:type="dxa" w:w="2664"/>
+          </w:tcPr>
+          <w:p>
+            <w:pPr>
+              <w:spacing w:before="0" w:after="0"/>
+            </w:pPr>
+            <w:r>
+              <w:rPr>
+                <w:sz w:val="20"/>
+              </w:rPr>
+              <w:t>Ask: would people choose this push if asked?</w:t>
+            </w:r>
+          </w:p>
+        </w:tc>
+      </w:tr>
+      <w:tr>
+        <w:trPr>
+          <w:cantSplit/>
+        </w:trPr>
+        <w:tc>
+          <w:tcPr>
+            <w:tcW w:type="dxa" w:w="2120"/>
+          </w:tcPr>
+          <w:p>
+            <w:pPr>
+              <w:spacing w:before="0" w:after="0"/>
+            </w:pPr>
+            <w:r>
+              <w:rPr>
+                <w:sz w:val="20"/>
+              </w:rPr>
+              <w:t>Cost against effect</w:t>
+            </w:r>
+          </w:p>
+        </w:tc>
+        <w:tc>
+          <w:tcPr>
+            <w:tcW w:type="dxa" w:w="4854"/>
+          </w:tcPr>
+          <w:p>
+            <w:pPr>
+              <w:spacing w:before="0" w:after="0"/>
+            </w:pPr>
+            <w:r>
+              <w:rPr>
+                <w:sz w:val="20"/>
+              </w:rPr>
+              <w:t>In the trial the effect shrank after the game ended (Patel et al. 2017, as reported).</w:t>
+            </w:r>
+          </w:p>
+        </w:tc>
+        <w:tc>
+          <w:tcPr>
+            <w:tcW w:type="dxa" w:w="2664"/>
+          </w:tcPr>
+          <w:p>
+            <w:pPr>
+              <w:spacing w:before="0" w:after="0"/>
+            </w:pPr>
+            <w:r>
+              <w:rPr>
+                <w:sz w:val="20"/>
+              </w:rPr>
+              <w:t>Count the cost over months, not only the first weeks.</w:t>
+            </w:r>
+          </w:p>
+        </w:tc>
+      </w:tr>
+    </w:tbl>
+    <w:p>
+      <w:pPr>
+        <w:spacing w:before="0" w:after="80"/>
+      </w:pPr>
+    </w:p>
     <w:tbl>
       <w:tblPr>
         <w:tblW w:w="9598" w:type="dxa"/>
@@ -6904,7 +8830,7 @@
             </w:pPr>
             <w:r>
               <w:rPr/>
-              <w:t>Brightwater Savings, Vera, Kaspar, Rhea and Dominik are made up for this example. The three levers are a reading of the example, not a rule for every product.</w:t>
+              <w:t>Brightwater Savings, Vera, Kaspar, Rhea and Dominik are made up for this example. The three levers are a reading of the example, not a rule for every product. The findings in the table of real evidence are real research results, rules and cases; the sources are listed below.</w:t>
             </w:r>
           </w:p>
         </w:tc>
@@ -7093,7 +9019,7 @@
           <w:color w:val="556274"/>
           <w:sz w:val="18"/>
         </w:rPr>
-        <w:t>Tversky &amp; Kahneman 1991 · Festinger 1954 · Deci et al. 1999</w:t>
+        <w:t>Tversky &amp; Kahneman 1991 · Festinger 1954 · Deci et al. 1999 · Patel et al. 2017 · Hamari et al. 2014 · Ryan &amp; Deci 2000</w:t>
       </w:r>
     </w:p>
     <w:p>
@@ -7586,6 +9512,266 @@
         <w:spacing w:before="0" w:after="80"/>
       </w:pPr>
     </w:p>
+    <w:p>
+      <w:pPr>
+        <w:spacing w:before="0" w:after="100"/>
+      </w:pPr>
+      <w:r>
+        <w:rPr>
+          <w:b/>
+        </w:rPr>
+        <w:t>Who answers for a mechanic: rules and evidence</w:t>
+      </w:r>
+    </w:p>
+    <w:tbl>
+      <w:tblPr>
+        <w:tblW w:w="9638" w:type="dxa"/>
+        <w:tblBorders>
+          <w:top w:val="single" w:sz="4" w:space="0" w:color="D5DEE9"/>
+          <w:left w:val="single" w:sz="4" w:space="0" w:color="D5DEE9"/>
+          <w:bottom w:val="single" w:sz="4" w:space="0" w:color="D5DEE9"/>
+          <w:right w:val="single" w:sz="4" w:space="0" w:color="D5DEE9"/>
+          <w:insideH w:val="single" w:sz="4" w:space="0" w:color="D5DEE9"/>
+          <w:insideV w:val="single" w:sz="4" w:space="0" w:color="D5DEE9"/>
+        </w:tblBorders>
+        <w:tblLayout w:type="fixed"/>
+        <w:tblCellMar>
+          <w:top w:w="60" w:type="dxa"/>
+          <w:left w:w="100" w:type="dxa"/>
+          <w:bottom w:w="60" w:type="dxa"/>
+          <w:right w:w="100" w:type="dxa"/>
+        </w:tblCellMar>
+      </w:tblPr>
+      <w:tblGrid>
+        <w:gridCol w:w="1503"/>
+        <w:gridCol w:w="4374"/>
+        <w:gridCol w:w="3761"/>
+      </w:tblGrid>
+      <w:tr>
+        <w:trPr>
+          <w:cantSplit/>
+          <w:tblHeader/>
+        </w:trPr>
+        <w:tc>
+          <w:tcPr>
+            <w:tcW w:type="dxa" w:w="1503"/>
+            <w:shd w:val="clear" w:color="auto" w:fill="E6ECF4"/>
+          </w:tcPr>
+          <w:p>
+            <w:pPr>
+              <w:spacing w:before="0" w:after="0"/>
+            </w:pPr>
+            <w:r>
+              <w:rPr>
+                <w:b/>
+                <w:sz w:val="20"/>
+              </w:rPr>
+              <w:t>Part</w:t>
+            </w:r>
+          </w:p>
+        </w:tc>
+        <w:tc>
+          <w:tcPr>
+            <w:tcW w:type="dxa" w:w="4374"/>
+            <w:shd w:val="clear" w:color="auto" w:fill="E6ECF4"/>
+          </w:tcPr>
+          <w:p>
+            <w:pPr>
+              <w:spacing w:before="0" w:after="0"/>
+            </w:pPr>
+            <w:r>
+              <w:rPr>
+                <w:b/>
+                <w:sz w:val="20"/>
+              </w:rPr>
+              <w:t>Evidence or rule</w:t>
+            </w:r>
+          </w:p>
+        </w:tc>
+        <w:tc>
+          <w:tcPr>
+            <w:tcW w:type="dxa" w:w="3761"/>
+            <w:shd w:val="clear" w:color="auto" w:fill="E6ECF4"/>
+          </w:tcPr>
+          <w:p>
+            <w:pPr>
+              <w:spacing w:before="0" w:after="0"/>
+            </w:pPr>
+            <w:r>
+              <w:rPr>
+                <w:b/>
+                <w:sz w:val="20"/>
+              </w:rPr>
+              <w:t>What it means</w:t>
+            </w:r>
+          </w:p>
+        </w:tc>
+      </w:tr>
+      <w:tr>
+        <w:trPr>
+          <w:cantSplit/>
+        </w:trPr>
+        <w:tc>
+          <w:tcPr>
+            <w:tcW w:type="dxa" w:w="1503"/>
+          </w:tcPr>
+          <w:p>
+            <w:pPr>
+              <w:spacing w:before="0" w:after="0"/>
+            </w:pPr>
+            <w:r>
+              <w:rPr>
+                <w:sz w:val="20"/>
+              </w:rPr>
+              <w:t>Who checks</w:t>
+            </w:r>
+          </w:p>
+        </w:tc>
+        <w:tc>
+          <w:tcPr>
+            <w:tcW w:type="dxa" w:w="4374"/>
+          </w:tcPr>
+          <w:p>
+            <w:pPr>
+              <w:spacing w:before="0" w:after="0"/>
+            </w:pPr>
+            <w:r>
+              <w:rPr>
+                <w:sz w:val="20"/>
+              </w:rPr>
+              <w:t>Article 25 of the EU Digital Services Act forbids manipulative interface design on online platforms.</w:t>
+            </w:r>
+          </w:p>
+        </w:tc>
+        <w:tc>
+          <w:tcPr>
+            <w:tcW w:type="dxa" w:w="3761"/>
+          </w:tcPr>
+          <w:p>
+            <w:pPr>
+              <w:spacing w:before="0" w:after="0"/>
+            </w:pPr>
+            <w:r>
+              <w:rPr>
+                <w:sz w:val="20"/>
+              </w:rPr>
+              <w:t>Have legal and the specialists check every ranking, notification and countdown.</w:t>
+            </w:r>
+          </w:p>
+        </w:tc>
+      </w:tr>
+      <w:tr>
+        <w:trPr>
+          <w:cantSplit/>
+        </w:trPr>
+        <w:tc>
+          <w:tcPr>
+            <w:tcW w:type="dxa" w:w="1503"/>
+          </w:tcPr>
+          <w:p>
+            <w:pPr>
+              <w:spacing w:before="0" w:after="0"/>
+            </w:pPr>
+            <w:r>
+              <w:rPr>
+                <w:sz w:val="20"/>
+              </w:rPr>
+              <w:t>How a mechanic leaves</w:t>
+            </w:r>
+          </w:p>
+        </w:tc>
+        <w:tc>
+          <w:tcPr>
+            <w:tcW w:type="dxa" w:w="4374"/>
+          </w:tcPr>
+          <w:p>
+            <w:pPr>
+              <w:spacing w:before="0" w:after="0"/>
+            </w:pPr>
+            <w:r>
+              <w:rPr>
+                <w:sz w:val="20"/>
+              </w:rPr>
+              <w:t>Effects decay after a mechanic ends or loses its novelty (Patel et al. 2017, as reported).</w:t>
+            </w:r>
+          </w:p>
+        </w:tc>
+        <w:tc>
+          <w:tcPr>
+            <w:tcW w:type="dxa" w:w="3761"/>
+          </w:tcPr>
+          <w:p>
+            <w:pPr>
+              <w:spacing w:before="0" w:after="0"/>
+            </w:pPr>
+            <w:r>
+              <w:rPr>
+                <w:sz w:val="20"/>
+              </w:rPr>
+              <w:t>Review each mechanic every year; remove what no longer earns its place.</w:t>
+            </w:r>
+          </w:p>
+        </w:tc>
+      </w:tr>
+      <w:tr>
+        <w:trPr>
+          <w:cantSplit/>
+        </w:trPr>
+        <w:tc>
+          <w:tcPr>
+            <w:tcW w:type="dxa" w:w="1503"/>
+          </w:tcPr>
+          <w:p>
+            <w:pPr>
+              <w:spacing w:before="0" w:after="0"/>
+            </w:pPr>
+            <w:r>
+              <w:rPr>
+                <w:sz w:val="20"/>
+              </w:rPr>
+              <w:t>Who owns</w:t>
+            </w:r>
+          </w:p>
+        </w:tc>
+        <w:tc>
+          <w:tcPr>
+            <w:tcW w:type="dxa" w:w="4374"/>
+          </w:tcPr>
+          <w:p>
+            <w:pPr>
+              <w:spacing w:before="0" w:after="0"/>
+            </w:pPr>
+            <w:r>
+              <w:rPr>
+                <w:sz w:val="20"/>
+              </w:rPr>
+              <w:t>Meaningful gamification has to be designed around the user's purposes (Nicholson 2015).</w:t>
+            </w:r>
+          </w:p>
+        </w:tc>
+        <w:tc>
+          <w:tcPr>
+            <w:tcW w:type="dxa" w:w="3761"/>
+          </w:tcPr>
+          <w:p>
+            <w:pPr>
+              <w:spacing w:before="0" w:after="0"/>
+            </w:pPr>
+            <w:r>
+              <w:rPr>
+                <w:sz w:val="20"/>
+              </w:rPr>
+              <w:t>Give one owner the principles and let every team build within them.</w:t>
+            </w:r>
+          </w:p>
+        </w:tc>
+      </w:tr>
+    </w:tbl>
+    <w:p>
+      <w:pPr>
+        <w:spacing w:before="0" w:after="80"/>
+      </w:pPr>
+    </w:p>
     <w:tbl>
       <w:tblPr>
         <w:tblW w:w="9598" w:type="dxa"/>
@@ -7635,7 +9821,7 @@
             </w:pPr>
             <w:r>
               <w:rPr/>
-              <w:t>Brightwater Savings, Vera, Kaspar, Rhea and Dominik are made up for this example. Deciding with limited information follows Simon (1956); the premortem follows Klein (2007).</w:t>
+              <w:t>Brightwater Savings, Vera, Kaspar, Rhea and Dominik are made up for this example. Deciding with limited information follows Simon (1956); the premortem follows Klein (2007). The findings in the table of real evidence are real research results, rules and cases; the sources are listed below.</w:t>
             </w:r>
           </w:p>
         </w:tc>
@@ -7824,7 +10010,7 @@
           <w:color w:val="556274"/>
           <w:sz w:val="18"/>
         </w:rPr>
-        <w:t>Simon 1956 · Klein 2007 · Nicholson 2015</w:t>
+        <w:t>Simon 1956 · Klein 2007 · Nicholson 2015 · EU Digital Services Act · Patel et al. 2017</w:t>
       </w:r>
     </w:p>
     <w:p>
@@ -8545,6 +10731,18 @@
         <w:rPr>
           <w:sz w:val="19"/>
         </w:rPr>
+        <w:t>Kivetz, R., Urminsky, O., &amp; Zheng, Y. (2006). The goal-gradient hypothesis resurrected: Purchase acceleration, illusionary goal progress, and customer retention. Journal of Marketing Research, 43(1), 39–58. (People speed up as they see themselves getting closer to a goal.)</w:t>
+      </w:r>
+    </w:p>
+    <w:p>
+      <w:pPr>
+        <w:spacing w:before="0" w:after="80"/>
+        <w:ind w:left="283" w:hanging="283"/>
+      </w:pPr>
+      <w:r>
+        <w:rPr>
+          <w:sz w:val="19"/>
+        </w:rPr>
         <w:t>Deci, E. L., Koestner, R., &amp; Ryan, R. M. (1999). A meta-analytic review of experiments examining the effects of extrinsic rewards on intrinsic motivation. Psychological Bulletin, 125(6), 627–668. (Expected, tangible rewards for an interesting activity tend to lower intrinsic motivation.)</w:t>
       </w:r>
     </w:p>
@@ -8569,18 +10767,6 @@
         <w:rPr>
           <w:sz w:val="19"/>
         </w:rPr>
-        <w:t>Kivetz, R., Urminsky, O., &amp; Zheng, Y. (2006). The goal-gradient hypothesis resurrected: Purchase acceleration, illusionary goal progress, and customer retention. Journal of Marketing Research, 43(1), 39–58. (People speed up as they see themselves getting closer to a goal.)</w:t>
-      </w:r>
-    </w:p>
-    <w:p>
-      <w:pPr>
-        <w:spacing w:before="0" w:after="80"/>
-        <w:ind w:left="283" w:hanging="283"/>
-      </w:pPr>
-      <w:r>
-        <w:rPr>
-          <w:sz w:val="19"/>
-        </w:rPr>
         <w:t>Lepper, M. R., Greene, D., &amp; Nisbett, R. E. (1973). Undermining children's intrinsic interest with extrinsic reward: A test of the “overjustification” hypothesis. Journal of Personality and Social Psychology, 28(1), 129–137. (The overjustification effect: a reward for something done gladly reduces doing it once the reward stops.)</w:t>
       </w:r>
     </w:p>
@@ -8593,7 +10779,43 @@
         <w:rPr>
           <w:sz w:val="19"/>
         </w:rPr>
+        <w:t>Patel, M. S., Benjamin, E. J., Volpp, K. G., et al. (2017). Effect of a game-based intervention designed to enhance social incentives to increase physical activity among families: The BE FIT randomized clinical trial. JAMA Internal Medicine, 177(11), 1586–1593. (200 adults of 94 families in a community heart study played a points-and-levels game for 12 weeks; daily steps rose more than in the control group, and the gain was smaller in the 12 weeks after. Figures from summaries; check the paper.)</w:t>
+      </w:r>
+    </w:p>
+    <w:p>
+      <w:pPr>
+        <w:spacing w:before="0" w:after="80"/>
+        <w:ind w:left="283" w:hanging="283"/>
+      </w:pPr>
+      <w:r>
+        <w:rPr>
+          <w:sz w:val="19"/>
+        </w:rPr>
         <w:t>Gibbons, S. (2018). Using Prioritization Matrices to Inform UX Decisions. Nielsen Norman Group. https://www.nngroup.com/articles/prioritization-matrices/ (Rate each option on the same few criteria, such as value to the user against effort, and put the reason next to each rating.)</w:t>
+      </w:r>
+    </w:p>
+    <w:p>
+      <w:pPr>
+        <w:spacing w:before="0" w:after="80"/>
+        <w:ind w:left="283" w:hanging="283"/>
+      </w:pPr>
+      <w:r>
+        <w:rPr>
+          <w:sz w:val="19"/>
+        </w:rPr>
+        <w:t>Mathur, A., Acar, G., Friedman, M. J., Lucherini, E., Mayer, J., Chetty, M., &amp; Narayanan, A. (2019). Dark patterns at scale: Findings from a crawl of 11K shopping websites. Proceedings of the ACM on Human-Computer Interaction, 3(CSCW), 1–32. (False urgency, scarcity and confirmshaming are widespread ways of using emotion against users.)</w:t>
+      </w:r>
+    </w:p>
+    <w:p>
+      <w:pPr>
+        <w:spacing w:before="0" w:after="80"/>
+        <w:ind w:left="283" w:hanging="283"/>
+      </w:pPr>
+      <w:r>
+        <w:rPr>
+          <w:sz w:val="19"/>
+        </w:rPr>
+        <w:t>Regulation (EU) 2022/2065 of the European Parliament and of the Council (Digital Services Act), Article 25. https://eur-lex.europa.eu/eli/reg/2022/2065/oj (Online platforms must not design their interfaces in a way that deceives or manipulates users or impairs their ability to make free and informed decisions.)</w:t>
       </w:r>
     </w:p>
     <w:p>

</xml_diff>